<commit_message>
Contracts: optional modules and partner services named in the Order Form, Implementation SOW and Contract Pack Index
- Order Form 1.1: new order table of the sixteen optional modules and partner services (man-days, unit price, quantity, price) after the one-time fees; payment schedule line for them, invoiced on delivery of each service.
- Implementation SOW 1.1.1: milestone payment item 4 lists each service and its rate; the exclusions on partner connectors and regulatory filings point to the corresponding services of the Rate Annex (S08).
- Contract Pack Index 1.1: sales checklist item 12a lists the services as separate Order Form lines, with the fee exclusion and the brand pack permission.
</commit_message>
<xml_diff>
--- a/docs/package/03_Contracts/iNXT_BrokerVerse_Contract_Pack_Index_and_Cover_Letter.docx
+++ b/docs/package/03_Contracts/iNXT_BrokerVerse_Contract_Pack_Index_and_Cover_Letter.docx
@@ -10,7 +10,7 @@
       <w:r>
         <w:rPr/>
         <w:drawing>
-          <wp:anchor behindDoc="1" distT="0" distB="0" distL="0" distR="0" simplePos="0" locked="0" layoutInCell="0" allowOverlap="1" relativeHeight="18">
+          <wp:anchor behindDoc="1" distT="0" distB="0" distL="0" distR="0" simplePos="0" locked="0" layoutInCell="0" allowOverlap="1" relativeHeight="19">
             <wp:simplePos x="0" y="0"/>
             <wp:positionH relativeFrom="margin">
               <wp:posOffset>-914400</wp:posOffset>
@@ -55,7 +55,7 @@
           </wp:anchor>
         </w:drawing>
         <w:drawing>
-          <wp:anchor behindDoc="1" distT="0" distB="0" distL="0" distR="0" simplePos="0" locked="0" layoutInCell="0" allowOverlap="1" relativeHeight="29">
+          <wp:anchor behindDoc="1" distT="0" distB="0" distL="0" distR="0" simplePos="0" locked="0" layoutInCell="0" allowOverlap="1" relativeHeight="30">
             <wp:simplePos x="0" y="0"/>
             <wp:positionH relativeFrom="margin">
               <wp:align>center</wp:align>
@@ -111,7 +111,7 @@
         <mc:AlternateContent>
           <mc:Choice Requires="wps">
             <w:drawing>
-              <wp:anchor behindDoc="0" distT="45720" distB="45720" distL="114300" distR="114300" simplePos="0" locked="0" layoutInCell="0" allowOverlap="1" relativeHeight="19" wp14:anchorId="3D43415C">
+              <wp:anchor behindDoc="0" distT="45720" distB="45720" distL="114300" distR="114300" simplePos="0" locked="0" layoutInCell="0" allowOverlap="1" relativeHeight="20" wp14:anchorId="3D43415C">
                 <wp:simplePos x="0" y="0"/>
                 <wp:positionH relativeFrom="page">
                   <wp:posOffset>194310</wp:posOffset>
@@ -226,7 +226,7 @@
         <mc:AlternateContent>
           <mc:Choice Requires="wps">
             <w:drawing>
-              <wp:anchor behindDoc="0" distT="45720" distB="45720" distL="113030" distR="114935" simplePos="0" locked="0" layoutInCell="0" allowOverlap="1" relativeHeight="21" wp14:anchorId="58C23128">
+              <wp:anchor behindDoc="0" distT="45720" distB="45720" distL="113030" distR="114935" simplePos="0" locked="0" layoutInCell="0" allowOverlap="1" relativeHeight="22" wp14:anchorId="58C23128">
                 <wp:simplePos x="0" y="0"/>
                 <wp:positionH relativeFrom="page">
                   <wp:posOffset>3094990</wp:posOffset>
@@ -285,7 +285,7 @@
                                 <w:bCs/>
                                 <w:color w:val="1D74BA"/>
                               </w:rPr>
-                              <w:t>1.0</w:t>
+                              <w:t>1.1</w:t>
                             </w:r>
                           </w:p>
                         </w:txbxContent>
@@ -328,7 +328,7 @@
                           <w:bCs/>
                           <w:color w:val="1D74BA"/>
                         </w:rPr>
-                        <w:t>1.0</w:t>
+                        <w:t>1.1</w:t>
                       </w:r>
                     </w:p>
                   </w:txbxContent>
@@ -341,7 +341,7 @@
         <mc:AlternateContent>
           <mc:Choice Requires="wps">
             <w:drawing>
-              <wp:anchor behindDoc="0" distT="45720" distB="45720" distL="114300" distR="113665" simplePos="0" locked="0" layoutInCell="0" allowOverlap="1" relativeHeight="23" wp14:anchorId="1BF25123">
+              <wp:anchor behindDoc="0" distT="45720" distB="45720" distL="114300" distR="113665" simplePos="0" locked="0" layoutInCell="0" allowOverlap="1" relativeHeight="24" wp14:anchorId="1BF25123">
                 <wp:simplePos x="0" y="0"/>
                 <wp:positionH relativeFrom="page">
                   <wp:posOffset>4992370</wp:posOffset>
@@ -400,7 +400,7 @@
                                 <w:bCs/>
                                 <w:color w:val="1D74BA"/>
                               </w:rPr>
-                              <w:t>03 October 2026</w:t>
+                              <w:t>04 October 2026</w:t>
                             </w:r>
                           </w:p>
                         </w:txbxContent>
@@ -443,7 +443,7 @@
                           <w:bCs/>
                           <w:color w:val="1D74BA"/>
                         </w:rPr>
-                        <w:t>03 October 2026</w:t>
+                        <w:t>04 October 2026</w:t>
                       </w:r>
                     </w:p>
                   </w:txbxContent>
@@ -456,7 +456,7 @@
         <mc:AlternateContent>
           <mc:Choice Requires="wps">
             <w:drawing>
-              <wp:anchor behindDoc="0" distT="45720" distB="46355" distL="114300" distR="114300" simplePos="0" locked="0" layoutInCell="0" allowOverlap="1" relativeHeight="25" wp14:anchorId="01DE2BF4">
+              <wp:anchor behindDoc="0" distT="45720" distB="46355" distL="114300" distR="114300" simplePos="0" locked="0" layoutInCell="0" allowOverlap="1" relativeHeight="26" wp14:anchorId="01DE2BF4">
                 <wp:simplePos x="0" y="0"/>
                 <wp:positionH relativeFrom="margin">
                   <wp:align>center</wp:align>
@@ -601,7 +601,7 @@
         <mc:AlternateContent>
           <mc:Choice Requires="wps">
             <w:drawing>
-              <wp:anchor behindDoc="0" distT="45720" distB="50800" distL="114300" distR="114300" simplePos="0" locked="0" layoutInCell="0" allowOverlap="1" relativeHeight="27" wp14:anchorId="204C02CC">
+              <wp:anchor behindDoc="0" distT="45720" distB="50800" distL="114300" distR="114300" simplePos="0" locked="0" layoutInCell="0" allowOverlap="1" relativeHeight="28" wp14:anchorId="204C02CC">
                 <wp:simplePos x="0" y="0"/>
                 <wp:positionH relativeFrom="margin">
                   <wp:align>center</wp:align>
@@ -789,7 +789,7 @@
             </w:rPr>
             <w:fldChar w:fldCharType="separate"/>
           </w:r>
-          <w:hyperlink w:anchor="__RefHeading___Toc14479_3066934455">
+          <w:hyperlink w:anchor="__RefHeading___Toc4022_1732366693">
             <w:r>
               <w:rPr>
                 <w:webHidden/>
@@ -824,7 +824,7 @@
             </w:tabs>
             <w:rPr/>
           </w:pPr>
-          <w:hyperlink w:anchor="__RefHeading___Toc14481_3066934455">
+          <w:hyperlink w:anchor="__RefHeading___Toc4024_1732366693">
             <w:r>
               <w:rPr>
                 <w:webHidden/>
@@ -853,7 +853,7 @@
             </w:tabs>
             <w:rPr/>
           </w:pPr>
-          <w:hyperlink w:anchor="__RefHeading___Toc14483_3066934455">
+          <w:hyperlink w:anchor="__RefHeading___Toc4026_1732366693">
             <w:r>
               <w:rPr>
                 <w:webHidden/>
@@ -875,7 +875,7 @@
             </w:tabs>
             <w:rPr/>
           </w:pPr>
-          <w:hyperlink w:anchor="__RefHeading___Toc14485_3066934455">
+          <w:hyperlink w:anchor="__RefHeading___Toc4028_1732366693">
             <w:r>
               <w:rPr>
                 <w:webHidden/>
@@ -897,7 +897,7 @@
             </w:tabs>
             <w:rPr/>
           </w:pPr>
-          <w:hyperlink w:anchor="__RefHeading___Toc14487_3066934455">
+          <w:hyperlink w:anchor="__RefHeading___Toc4030_1732366693">
             <w:r>
               <w:rPr>
                 <w:webHidden/>
@@ -919,7 +919,7 @@
             </w:tabs>
             <w:rPr/>
           </w:pPr>
-          <w:hyperlink w:anchor="__RefHeading___Toc14489_3066934455">
+          <w:hyperlink w:anchor="__RefHeading___Toc4032_1732366693">
             <w:r>
               <w:rPr>
                 <w:webHidden/>
@@ -941,7 +941,7 @@
             </w:tabs>
             <w:rPr/>
           </w:pPr>
-          <w:hyperlink w:anchor="__RefHeading___Toc14491_3066934455">
+          <w:hyperlink w:anchor="__RefHeading___Toc4034_1732366693">
             <w:r>
               <w:rPr>
                 <w:webHidden/>
@@ -963,7 +963,7 @@
             </w:tabs>
             <w:rPr/>
           </w:pPr>
-          <w:hyperlink w:anchor="__RefHeading___Toc14493_3066934455">
+          <w:hyperlink w:anchor="__RefHeading___Toc4036_1732366693">
             <w:r>
               <w:rPr>
                 <w:webHidden/>
@@ -985,7 +985,7 @@
             </w:tabs>
             <w:rPr/>
           </w:pPr>
-          <w:hyperlink w:anchor="__RefHeading___Toc14495_3066934455">
+          <w:hyperlink w:anchor="__RefHeading___Toc4038_1732366693">
             <w:r>
               <w:rPr>
                 <w:webHidden/>
@@ -1007,7 +1007,7 @@
             </w:tabs>
             <w:rPr/>
           </w:pPr>
-          <w:hyperlink w:anchor="__RefHeading___Toc14497_3066934455">
+          <w:hyperlink w:anchor="__RefHeading___Toc4040_1732366693">
             <w:r>
               <w:rPr>
                 <w:webHidden/>
@@ -1029,7 +1029,7 @@
             </w:tabs>
             <w:rPr/>
           </w:pPr>
-          <w:hyperlink w:anchor="__RefHeading___Toc14499_3066934455">
+          <w:hyperlink w:anchor="__RefHeading___Toc4042_1732366693">
             <w:r>
               <w:rPr>
                 <w:webHidden/>
@@ -1051,7 +1051,7 @@
             </w:tabs>
             <w:rPr/>
           </w:pPr>
-          <w:hyperlink w:anchor="__RefHeading___Toc14501_3066934455">
+          <w:hyperlink w:anchor="__RefHeading___Toc4044_1732366693">
             <w:r>
               <w:rPr>
                 <w:webHidden/>
@@ -1073,7 +1073,7 @@
             </w:tabs>
             <w:rPr/>
           </w:pPr>
-          <w:hyperlink w:anchor="__RefHeading___Toc14503_3066934455">
+          <w:hyperlink w:anchor="__RefHeading___Toc4046_1732366693">
             <w:r>
               <w:rPr>
                 <w:webHidden/>
@@ -1081,7 +1081,7 @@
               </w:rPr>
               <w:t>6.3 Hand-off</w:t>
               <w:tab/>
-              <w:t>11</w:t>
+              <w:t>12</w:t>
             </w:r>
           </w:hyperlink>
         </w:p>
@@ -1095,7 +1095,7 @@
             </w:tabs>
             <w:rPr/>
           </w:pPr>
-          <w:hyperlink w:anchor="__RefHeading___Toc14505_3066934455">
+          <w:hyperlink w:anchor="__RefHeading___Toc4048_1732366693">
             <w:r>
               <w:rPr>
                 <w:webHidden/>
@@ -1103,7 +1103,7 @@
               </w:rPr>
               <w:t>7. Checklist for the legal team</w:t>
               <w:tab/>
-              <w:t>12</w:t>
+              <w:t>13</w:t>
             </w:r>
           </w:hyperlink>
         </w:p>
@@ -1117,7 +1117,7 @@
             </w:tabs>
             <w:rPr/>
           </w:pPr>
-          <w:hyperlink w:anchor="__RefHeading___Toc14507_3066934455">
+          <w:hyperlink w:anchor="__RefHeading___Toc4050_1732366693">
             <w:r>
               <w:rPr>
                 <w:webHidden/>
@@ -1125,7 +1125,7 @@
               </w:rPr>
               <w:t>7.1 Always</w:t>
               <w:tab/>
-              <w:t>12</w:t>
+              <w:t>13</w:t>
             </w:r>
           </w:hyperlink>
         </w:p>
@@ -1139,7 +1139,7 @@
             </w:tabs>
             <w:rPr/>
           </w:pPr>
-          <w:hyperlink w:anchor="__RefHeading___Toc14509_3066934455">
+          <w:hyperlink w:anchor="__RefHeading___Toc4052_1732366693">
             <w:r>
               <w:rPr>
                 <w:webHidden/>
@@ -1147,7 +1147,7 @@
               </w:rPr>
               <w:t>7.2 Legal review required before release</w:t>
               <w:tab/>
-              <w:t>12</w:t>
+              <w:t>13</w:t>
             </w:r>
           </w:hyperlink>
         </w:p>
@@ -1161,7 +1161,7 @@
             </w:tabs>
             <w:rPr/>
           </w:pPr>
-          <w:hyperlink w:anchor="__RefHeading___Toc14511_3066934455">
+          <w:hyperlink w:anchor="__RefHeading___Toc4054_1732366693">
             <w:r>
               <w:rPr>
                 <w:webHidden/>
@@ -1169,7 +1169,7 @@
               </w:rPr>
               <w:t>8. Owner and legal decisions open</w:t>
               <w:tab/>
-              <w:t>13</w:t>
+              <w:t>14</w:t>
             </w:r>
           </w:hyperlink>
         </w:p>
@@ -1183,7 +1183,7 @@
             </w:tabs>
             <w:rPr/>
           </w:pPr>
-          <w:hyperlink w:anchor="__RefHeading___Toc14513_3066934455">
+          <w:hyperlink w:anchor="__RefHeading___Toc4056_1732366693">
             <w:r>
               <w:rPr>
                 <w:webHidden/>
@@ -1198,7 +1198,7 @@
                 <w:rStyle w:val="IndexLink"/>
               </w:rPr>
               <w:tab/>
-              <w:t>14</w:t>
+              <w:t>15</w:t>
             </w:r>
           </w:hyperlink>
           <w:r>
@@ -1231,7 +1231,7 @@
       <w:r>
         <w:br w:type="page"/>
       </w:r>
-      <w:bookmarkStart w:id="0" w:name="__RefHeading___Toc14479_3066934455"/>
+      <w:bookmarkStart w:id="0" w:name="__RefHeading___Toc4022_1732366693"/>
       <w:bookmarkStart w:id="1" w:name="_Toc48319687"/>
       <w:bookmarkStart w:id="2" w:name="_Toc11824118"/>
       <w:bookmarkEnd w:id="0"/>
@@ -1588,7 +1588,7 @@
                 <w:szCs w:val="24"/>
                 <w:lang w:val="en-US" w:eastAsia="ja-JP" w:bidi="ar-SA"/>
               </w:rPr>
-              <w:t>03 October 2026</w:t>
+              <w:t>04 October 2026</w:t>
             </w:r>
           </w:p>
         </w:tc>
@@ -1625,7 +1625,7 @@
                 <w:szCs w:val="24"/>
                 <w:lang w:val="en-US" w:eastAsia="ja-JP" w:bidi="ar-SA"/>
               </w:rPr>
-              <w:t>1.0</w:t>
+              <w:t>1.1</w:t>
             </w:r>
           </w:p>
         </w:tc>
@@ -1773,7 +1773,7 @@
                 <w:szCs w:val="24"/>
                 <w:lang w:val="en-US" w:eastAsia="ja-JP" w:bidi="ar-SA"/>
               </w:rPr>
-              <w:t>Template for discussion; subject to review by iorta TechNXT legal counsel</w:t>
+              <w:t>Sales checklist names the optional modules and partner services of the Rate Annex (S08); template for discussion; subject to review by iorta TechNXT legal counsel</w:t>
             </w:r>
           </w:p>
         </w:tc>
@@ -1876,7 +1876,7 @@
           <w:spacing w:val="0"/>
         </w:rPr>
       </w:pPr>
-      <w:bookmarkStart w:id="4" w:name="__RefHeading___Toc14481_3066934455"/>
+      <w:bookmarkStart w:id="4" w:name="__RefHeading___Toc4024_1732366693"/>
       <w:bookmarkStart w:id="5" w:name="_Toc233203388"/>
       <w:bookmarkEnd w:id="4"/>
       <w:r>
@@ -3813,7 +3813,7 @@
         <w:pageBreakBefore w:val="false"/>
         <w:rPr/>
       </w:pPr>
-      <w:bookmarkStart w:id="6" w:name="__RefHeading___Toc14483_3066934455"/>
+      <w:bookmarkStart w:id="6" w:name="__RefHeading___Toc4026_1732366693"/>
       <w:bookmarkEnd w:id="6"/>
       <w:r>
         <w:rPr>
@@ -3970,7 +3970,7 @@
         <w:pStyle w:val="Heading1"/>
         <w:rPr/>
       </w:pPr>
-      <w:bookmarkStart w:id="7" w:name="__RefHeading___Toc14485_3066934455"/>
+      <w:bookmarkStart w:id="7" w:name="__RefHeading___Toc4028_1732366693"/>
       <w:bookmarkEnd w:id="7"/>
       <w:r>
         <w:rPr>
@@ -6403,7 +6403,7 @@
         <w:pStyle w:val="Heading1"/>
         <w:rPr/>
       </w:pPr>
-      <w:bookmarkStart w:id="8" w:name="__RefHeading___Toc14487_3066934455"/>
+      <w:bookmarkStart w:id="8" w:name="__RefHeading___Toc4030_1732366693"/>
       <w:bookmarkEnd w:id="8"/>
       <w:r>
         <w:rPr>
@@ -6420,7 +6420,7 @@
         <w:pStyle w:val="Heading2"/>
         <w:rPr/>
       </w:pPr>
-      <w:bookmarkStart w:id="9" w:name="__RefHeading___Toc14489_3066934455"/>
+      <w:bookmarkStart w:id="9" w:name="__RefHeading___Toc4032_1732366693"/>
       <w:bookmarkEnd w:id="9"/>
       <w:r>
         <w:rPr>
@@ -10101,7 +10101,7 @@
         <w:pStyle w:val="Heading2"/>
         <w:rPr/>
       </w:pPr>
-      <w:bookmarkStart w:id="10" w:name="__RefHeading___Toc14491_3066934455"/>
+      <w:bookmarkStart w:id="10" w:name="__RefHeading___Toc4034_1732366693"/>
       <w:bookmarkEnd w:id="10"/>
       <w:r>
         <w:rPr>
@@ -13634,7 +13634,7 @@
         <w:pStyle w:val="Heading2"/>
         <w:rPr/>
       </w:pPr>
-      <w:bookmarkStart w:id="11" w:name="__RefHeading___Toc14493_3066934455"/>
+      <w:bookmarkStart w:id="11" w:name="__RefHeading___Toc4036_1732366693"/>
       <w:bookmarkEnd w:id="11"/>
       <w:r>
         <w:rPr>
@@ -15762,7 +15762,7 @@
         <w:pStyle w:val="Heading2"/>
         <w:rPr/>
       </w:pPr>
-      <w:bookmarkStart w:id="12" w:name="__RefHeading___Toc14495_3066934455"/>
+      <w:bookmarkStart w:id="12" w:name="__RefHeading___Toc4038_1732366693"/>
       <w:bookmarkEnd w:id="12"/>
       <w:r>
         <w:rPr>
@@ -16518,7 +16518,7 @@
         <w:pStyle w:val="Heading1"/>
         <w:rPr/>
       </w:pPr>
-      <w:bookmarkStart w:id="13" w:name="__RefHeading___Toc14497_3066934455"/>
+      <w:bookmarkStart w:id="13" w:name="__RefHeading___Toc4040_1732366693"/>
       <w:bookmarkEnd w:id="13"/>
       <w:r>
         <w:rPr>
@@ -16550,7 +16550,7 @@
         <w:pStyle w:val="Heading2"/>
         <w:rPr/>
       </w:pPr>
-      <w:bookmarkStart w:id="14" w:name="__RefHeading___Toc14499_3066934455"/>
+      <w:bookmarkStart w:id="14" w:name="__RefHeading___Toc4042_1732366693"/>
       <w:bookmarkEnd w:id="14"/>
       <w:r>
         <w:rPr>
@@ -17518,7 +17518,7 @@
         <w:pStyle w:val="Heading2"/>
         <w:rPr/>
       </w:pPr>
-      <w:bookmarkStart w:id="15" w:name="__RefHeading___Toc14501_3066934455"/>
+      <w:bookmarkStart w:id="15" w:name="__RefHeading___Toc4044_1732366693"/>
       <w:bookmarkEnd w:id="15"/>
       <w:r>
         <w:rPr>
@@ -18277,6 +18277,120 @@
                 <w:szCs w:val="24"/>
                 <w:lang w:val="en-US" w:eastAsia="ja-JP" w:bidi="ar-SA"/>
               </w:rPr>
+              <w:t>12a</w:t>
+            </w:r>
+          </w:p>
+        </w:tc>
+        <w:tc>
+          <w:tcPr>
+            <w:tcW w:w="7201" w:type="dxa"/>
+            <w:tcBorders>
+              <w:top w:val="single" w:sz="4" w:space="0" w:color="BFC7D1"/>
+              <w:left w:val="single" w:sz="4" w:space="0" w:color="BFC7D1"/>
+              <w:bottom w:val="single" w:sz="4" w:space="0" w:color="BFC7D1"/>
+              <w:right w:val="single" w:sz="4" w:space="0" w:color="BFC7D1"/>
+            </w:tcBorders>
+          </w:tcPr>
+          <w:p>
+            <w:pPr>
+              <w:pStyle w:val="Normal"/>
+              <w:widowControl/>
+              <w:spacing w:lineRule="auto" w:line="240" w:before="0" w:after="20"/>
+              <w:jc w:val="left"/>
+              <w:rPr>
+                <w:rFonts w:ascii="Aptos" w:hAnsi="Aptos" w:eastAsia="ＭＳ 明朝" w:cs="Arial"/>
+                <w:kern w:val="0"/>
+                <w:sz w:val="24"/>
+                <w:szCs w:val="24"/>
+                <w:lang w:val="en-US" w:eastAsia="ja-JP" w:bidi="ar-SA"/>
+              </w:rPr>
+            </w:pPr>
+            <w:r>
+              <w:rPr>
+                <w:rFonts w:eastAsia="Segoe UI" w:cs="Segoe UI" w:ascii="Segoe UI" w:hAnsi="Segoe UI"/>
+                <w:color w:val="101820"/>
+                <w:kern w:val="0"/>
+                <w:sz w:val="18"/>
+                <w:szCs w:val="24"/>
+                <w:lang w:val="en-US" w:eastAsia="ja-JP" w:bidi="ar-SA"/>
+              </w:rPr>
+              <w:t>Optional modules and partner services ordered, each as its own Order Form line at the Rate Annex (S08) rate, invoiced on delivery: connector go-live with a partner; activation of the AML/CFT toolkit; activation of the IC compliance registers; activation of the BIR pack; dealer programme set-up; Client brand pack (written permission of the mark's owner on file); AMLC reporting file validation and portal test; IC annual statement form alignment; EOPT invoicing review with the Client's tax adviser; BIR CAS registration support; BIR EIS enrolment and certification; CTPL authentication and LTO interface certification; insurer API onboarding; bank payment file certification; SMS or Viber gateway activation; screening list provider onboarding. Regulator and partner fees excluded; filings in the Client's name</w:t>
+            </w:r>
+          </w:p>
+        </w:tc>
+        <w:tc>
+          <w:tcPr>
+            <w:tcW w:w="907" w:type="dxa"/>
+            <w:tcBorders>
+              <w:top w:val="single" w:sz="4" w:space="0" w:color="BFC7D1"/>
+              <w:left w:val="single" w:sz="4" w:space="0" w:color="BFC7D1"/>
+              <w:bottom w:val="single" w:sz="4" w:space="0" w:color="BFC7D1"/>
+              <w:right w:val="single" w:sz="4" w:space="0" w:color="BFC7D1"/>
+            </w:tcBorders>
+          </w:tcPr>
+          <w:p>
+            <w:pPr>
+              <w:pStyle w:val="Normal"/>
+              <w:widowControl/>
+              <w:spacing w:lineRule="auto" w:line="240" w:before="0" w:after="20"/>
+              <w:jc w:val="left"/>
+              <w:rPr>
+                <w:rFonts w:ascii="Aptos" w:hAnsi="Aptos" w:eastAsia="ＭＳ 明朝" w:cs="Arial"/>
+                <w:kern w:val="0"/>
+                <w:sz w:val="24"/>
+                <w:szCs w:val="24"/>
+                <w:lang w:val="en-US" w:eastAsia="ja-JP" w:bidi="ar-SA"/>
+              </w:rPr>
+            </w:pPr>
+            <w:r>
+              <w:rPr>
+                <w:rFonts w:eastAsia="Segoe UI" w:cs="Segoe UI" w:ascii="Segoe UI" w:hAnsi="Segoe UI"/>
+                <w:color w:val="101820"/>
+                <w:kern w:val="0"/>
+                <w:sz w:val="18"/>
+                <w:szCs w:val="24"/>
+                <w:lang w:val="en-US" w:eastAsia="ja-JP" w:bidi="ar-SA"/>
+              </w:rPr>
+              <w:t>[ ]</w:t>
+            </w:r>
+          </w:p>
+        </w:tc>
+      </w:tr>
+      <w:tr>
+        <w:trPr/>
+        <w:tc>
+          <w:tcPr>
+            <w:tcW w:w="906" w:type="dxa"/>
+            <w:tcBorders>
+              <w:top w:val="single" w:sz="4" w:space="0" w:color="BFC7D1"/>
+              <w:left w:val="single" w:sz="4" w:space="0" w:color="BFC7D1"/>
+              <w:bottom w:val="single" w:sz="4" w:space="0" w:color="BFC7D1"/>
+              <w:right w:val="single" w:sz="4" w:space="0" w:color="BFC7D1"/>
+            </w:tcBorders>
+          </w:tcPr>
+          <w:p>
+            <w:pPr>
+              <w:pStyle w:val="Normal"/>
+              <w:widowControl/>
+              <w:spacing w:lineRule="auto" w:line="240" w:before="0" w:after="20"/>
+              <w:jc w:val="left"/>
+              <w:rPr>
+                <w:rFonts w:ascii="Aptos" w:hAnsi="Aptos" w:eastAsia="ＭＳ 明朝" w:cs="Arial"/>
+                <w:kern w:val="0"/>
+                <w:sz w:val="24"/>
+                <w:szCs w:val="24"/>
+                <w:lang w:val="en-US" w:eastAsia="ja-JP" w:bidi="ar-SA"/>
+              </w:rPr>
+            </w:pPr>
+            <w:r>
+              <w:rPr>
+                <w:rFonts w:eastAsia="Segoe UI" w:cs="Segoe UI" w:ascii="Segoe UI" w:hAnsi="Segoe UI"/>
+                <w:color w:val="101820"/>
+                <w:kern w:val="0"/>
+                <w:sz w:val="18"/>
+                <w:szCs w:val="24"/>
+                <w:lang w:val="en-US" w:eastAsia="ja-JP" w:bidi="ar-SA"/>
+              </w:rPr>
               <w:t>13</w:t>
             </w:r>
           </w:p>
@@ -18942,7 +19056,7 @@
         <w:pStyle w:val="Heading2"/>
         <w:rPr/>
       </w:pPr>
-      <w:bookmarkStart w:id="16" w:name="__RefHeading___Toc14503_3066934455"/>
+      <w:bookmarkStart w:id="16" w:name="__RefHeading___Toc4046_1732366693"/>
       <w:bookmarkEnd w:id="16"/>
       <w:r>
         <w:rPr>
@@ -19333,7 +19447,7 @@
       <w:r>
         <w:br w:type="page"/>
       </w:r>
-      <w:bookmarkStart w:id="17" w:name="__RefHeading___Toc14505_3066934455"/>
+      <w:bookmarkStart w:id="17" w:name="__RefHeading___Toc4048_1732366693"/>
       <w:bookmarkEnd w:id="17"/>
       <w:r>
         <w:rPr>
@@ -19350,7 +19464,7 @@
         <w:pStyle w:val="Heading2"/>
         <w:rPr/>
       </w:pPr>
-      <w:bookmarkStart w:id="18" w:name="__RefHeading___Toc14507_3066934455"/>
+      <w:bookmarkStart w:id="18" w:name="__RefHeading___Toc4050_1732366693"/>
       <w:bookmarkEnd w:id="18"/>
       <w:r>
         <w:rPr>
@@ -20318,7 +20432,7 @@
         <w:pStyle w:val="Heading2"/>
         <w:rPr/>
       </w:pPr>
-      <w:bookmarkStart w:id="19" w:name="__RefHeading___Toc14509_3066934455"/>
+      <w:bookmarkStart w:id="19" w:name="__RefHeading___Toc4052_1732366693"/>
       <w:bookmarkEnd w:id="19"/>
       <w:r>
         <w:rPr>
@@ -21636,7 +21750,7 @@
       <w:r>
         <w:br w:type="page"/>
       </w:r>
-      <w:bookmarkStart w:id="20" w:name="__RefHeading___Toc14511_3066934455"/>
+      <w:bookmarkStart w:id="20" w:name="__RefHeading___Toc4054_1732366693"/>
       <w:bookmarkEnd w:id="20"/>
       <w:r>
         <w:rPr>
@@ -22383,7 +22497,7 @@
       <w:r>
         <w:br w:type="page"/>
       </w:r>
-      <w:bookmarkStart w:id="21" w:name="__RefHeading___Toc14513_3066934455"/>
+      <w:bookmarkStart w:id="21" w:name="__RefHeading___Toc4056_1732366693"/>
       <w:bookmarkStart w:id="22" w:name="_Toc233203395"/>
       <w:bookmarkEnd w:id="21"/>
       <w:r>
@@ -24142,7 +24256,7 @@
       <w:r>
         <w:rPr/>
         <w:drawing>
-          <wp:anchor behindDoc="1" distT="0" distB="0" distL="0" distR="0" simplePos="0" locked="0" layoutInCell="0" allowOverlap="1" relativeHeight="17">
+          <wp:anchor behindDoc="1" distT="0" distB="0" distL="0" distR="0" simplePos="0" locked="0" layoutInCell="0" allowOverlap="1" relativeHeight="18">
             <wp:simplePos x="0" y="0"/>
             <wp:positionH relativeFrom="margin">
               <wp:align>center</wp:align>
@@ -24213,7 +24327,7 @@
     <w:r>
       <w:rPr/>
       <w:drawing>
-        <wp:anchor behindDoc="1" distT="0" distB="0" distL="0" distR="0" simplePos="0" locked="0" layoutInCell="0" allowOverlap="1" relativeHeight="16">
+        <wp:anchor behindDoc="1" distT="0" distB="0" distL="0" distR="0" simplePos="0" locked="0" layoutInCell="0" allowOverlap="1" relativeHeight="17">
           <wp:simplePos x="0" y="0"/>
           <wp:positionH relativeFrom="page">
             <wp:align>left</wp:align>
@@ -24272,7 +24386,7 @@
     <w:r>
       <w:rPr/>
       <w:drawing>
-        <wp:anchor behindDoc="1" distT="0" distB="0" distL="0" distR="0" simplePos="0" locked="0" layoutInCell="0" allowOverlap="1" relativeHeight="16">
+        <wp:anchor behindDoc="1" distT="0" distB="0" distL="0" distR="0" simplePos="0" locked="0" layoutInCell="0" allowOverlap="1" relativeHeight="17">
           <wp:simplePos x="0" y="0"/>
           <wp:positionH relativeFrom="page">
             <wp:align>left</wp:align>

</xml_diff>